<commit_message>
Regenerate PDF and DOCX reports with author name Yohaan Saji
</commit_message>
<xml_diff>
--- a/report/Customer_Churn_Report.docx
+++ b/report/Customer_Churn_Report.docx
@@ -18,7 +18,15 @@
         <w:jc w:val="center"/>
       </w:pPr>
       <w:r>
-        <w:t>Author: J P Pankaj Singh</w:t>
+        <w:t>Author: Yohaan Saji</w:t>
+      </w:r>
+    </w:p>
+    <w:p>
+      <w:pPr>
+        <w:jc w:val="center"/>
+      </w:pPr>
+      <w:r>
+        <w:t>Date: August 04, 2026</w:t>
       </w:r>
     </w:p>
     <w:p>
@@ -628,17 +636,6 @@
         <w:t>There is no information regarding the reason for churn, making it difficult to distinguish between unavoidable churn (e.g., death, relocation) and preventable churn (e.g., competitor offers).</w:t>
       </w:r>
     </w:p>
-    <w:p>
-      <w:pPr>
-        <w:jc w:val="center"/>
-      </w:pPr>
-      <w:r>
-        <w:rPr>
-          <w:i/>
-        </w:rPr>
-        <w:t>Contributor: ps-creater's team</w:t>
-      </w:r>
-    </w:p>
     <w:sectPr>
       <w:pgSz w:w="12240" w:h="15840"/>
       <w:pgMar w:top="1440" w:right="1800" w:bottom="1440" w:left="1800" w:header="720" w:footer="720" w:gutter="0"/>

</xml_diff>

<commit_message>
Remove date from DOCX report title page
</commit_message>
<xml_diff>
--- a/report/Customer_Churn_Report.docx
+++ b/report/Customer_Churn_Report.docx
@@ -19,14 +19,6 @@
       </w:pPr>
       <w:r>
         <w:t>Author: Yohaan Saji</w:t>
-      </w:r>
-    </w:p>
-    <w:p>
-      <w:pPr>
-        <w:jc w:val="center"/>
-      </w:pPr>
-      <w:r>
-        <w:t>Date: August 04, 2026</w:t>
       </w:r>
     </w:p>
     <w:p>

</xml_diff>